<commit_message>
Update: Add R2 and MAE metric explanations in UI and update model/testing scripts
</commit_message>
<xml_diff>
--- a/ml_model/Panduan_Pengujian_Linear_Regression_dan_Random_Forest.docx
+++ b/ml_model/Panduan_Pengujian_Linear_Regression_dan_Random_Forest.docx
@@ -190,7 +190,7 @@
                 <w:color w:val="000000"/>
                 <w:sz w:val="20"/>
               </w:rPr>
-              <w:t>6.742 transaksi</w:t>
+              <w:t>6.742 transaksi (6.741 data bersih)</w:t>
             </w:r>
           </w:p>
         </w:tc>
@@ -250,7 +250,7 @@
                 <w:color w:val="000000"/>
                 <w:sz w:val="20"/>
               </w:rPr>
-              <w:t>80% training dan 20% testing</w:t>
+              <w:t>80% training dan 20% testing secara kronologis</w:t>
             </w:r>
           </w:p>
         </w:tc>
@@ -478,7 +478,7 @@
           <w:color w:val="000000"/>
           <w:sz w:val="22"/>
         </w:rPr>
-        <w:t>Pengujian model dilakukan untuk mengetahui kemampuan Linear Regression dan Random Forest dalam memprediksi jumlah permintaan bahan kue. Dataset berisi 6.742 transaksi dan dibagi menjadi 5.393 data training serta 1.349 data testing menggunakan rasio 80:20.</w:t>
+        <w:t>Pengujian model dilakukan untuk mengetahui kemampuan Linear Regression dan Random Forest dalam memprediksi jumlah permintaan bahan kue. Dataset berisi 6.742 transaksi, dengan 1 baris memiliki missing value pada produk_encoded sehingga menghasilkan 6.741 data bersih. Data tersebut dibagi secara kronologis menjadi 5.392 data training serta 1.349 data testing menggunakan rasio 80:20.</w:t>
       </w:r>
     </w:p>
     <w:tbl>
@@ -1571,7 +1571,7 @@
                 <w:color w:val="000000"/>
                 <w:sz w:val="19"/>
               </w:rPr>
-              <w:t>6.742 transaksi</w:t>
+              <w:t>6.742 transaksi (6.741 data bersih)</w:t>
             </w:r>
           </w:p>
         </w:tc>
@@ -1631,7 +1631,7 @@
                 <w:color w:val="000000"/>
                 <w:sz w:val="19"/>
               </w:rPr>
-              <w:t>5.393 transaksi atau 80%</w:t>
+              <w:t>5.392 transaksi atau 80% (periode 2021-01-01 s/d 2024-12-28)</w:t>
             </w:r>
           </w:p>
         </w:tc>
@@ -1689,7 +1689,7 @@
                 <w:color w:val="000000"/>
                 <w:sz w:val="19"/>
               </w:rPr>
-              <w:t>1.349 transaksi atau 20%</w:t>
+              <w:t>1.349 transaksi atau 20% (periode 2024-12-28 s/d 2025-12-31)</w:t>
             </w:r>
           </w:p>
         </w:tc>
@@ -1807,7 +1807,7 @@
                 <w:color w:val="000000"/>
                 <w:sz w:val="19"/>
               </w:rPr>
-              <w:t>10 fitur</w:t>
+              <w:t>9 fitur</w:t>
             </w:r>
           </w:p>
         </w:tc>
@@ -2019,7 +2019,7 @@
                 <w:color w:val="000000"/>
                 <w:sz w:val="19"/>
               </w:rPr>
-              <w:t>Kode angka produk</w:t>
+              <w:t>Kode angka produk (diubah menggunakan LabelEncoder)</w:t>
             </w:r>
           </w:p>
         </w:tc>
@@ -2369,7 +2369,7 @@
                 <w:color w:val="000000"/>
                 <w:sz w:val="19"/>
               </w:rPr>
-              <w:t>Kode hari dalam minggu</w:t>
+              <w:t>Kode hari dalam minggu transaksi</w:t>
             </w:r>
           </w:p>
         </w:tc>
@@ -2516,7 +2516,7 @@
                 <w:color w:val="000000"/>
                 <w:sz w:val="19"/>
               </w:rPr>
-              <w:t>total_harga_update</w:t>
+              <w:t>hari_minggu</w:t>
             </w:r>
           </w:p>
         </w:tc>
@@ -2544,7 +2544,7 @@
                 <w:color w:val="000000"/>
                 <w:sz w:val="19"/>
               </w:rPr>
-              <w:t>Total harga transaksi</w:t>
+              <w:t>Kode hari minggu (dayofweek)</w:t>
             </w:r>
           </w:p>
         </w:tc>
@@ -2604,7 +2604,7 @@
                 <w:color w:val="000000"/>
                 <w:sz w:val="19"/>
               </w:rPr>
-              <w:t>hari_minggu</w:t>
+              <w:t>nama_produk_encoded</w:t>
             </w:r>
           </w:p>
         </w:tc>
@@ -2633,7 +2633,7 @@
                 <w:color w:val="000000"/>
                 <w:sz w:val="19"/>
               </w:rPr>
-              <w:t>Duplikasi informasi hari dalam minggu</w:t>
+              <w:t>Nama produk yang telah diubah menggunakan LabelEncoder</w:t>
             </w:r>
           </w:p>
         </w:tc>
@@ -2691,7 +2691,7 @@
                 <w:color w:val="000000"/>
                 <w:sz w:val="19"/>
               </w:rPr>
-              <w:t>nama_produk_encoded</w:t>
+              <w:t>kategori_produk_encoded</w:t>
             </w:r>
           </w:p>
         </w:tc>
@@ -2719,96 +2719,7 @@
                 <w:color w:val="000000"/>
                 <w:sz w:val="19"/>
               </w:rPr>
-              <w:t>Nama produk yang telah diubah menjadi angka</w:t>
-            </w:r>
-          </w:p>
-        </w:tc>
-      </w:tr>
-      <w:tr>
-        <w:tc>
-          <w:tcPr>
-            <w:tcW w:type="dxa" w:w="864"/>
-            <w:tcMar>
-              <w:top w:w="100" w:type="dxa"/>
-              <w:start w:w="120" w:type="dxa"/>
-              <w:bottom w:w="100" w:type="dxa"/>
-              <w:end w:w="120" w:type="dxa"/>
-            </w:tcMar>
-            <w:vAlign w:val="center"/>
-            <w:shd w:fill="F2F4F7"/>
-          </w:tcPr>
-          <w:p>
-            <w:pPr>
-              <w:spacing w:after="0"/>
-              <w:jc w:val="left"/>
-            </w:pPr>
-            <w:r>
-              <w:rPr>
-                <w:rFonts w:ascii="Calibri" w:hAnsi="Calibri"/>
-                <w:b w:val="0"/>
-                <w:i w:val="0"/>
-                <w:color w:val="000000"/>
-                <w:sz w:val="19"/>
-              </w:rPr>
-              <w:t>10</w:t>
-            </w:r>
-          </w:p>
-        </w:tc>
-        <w:tc>
-          <w:tcPr>
-            <w:tcW w:type="dxa" w:w="3312"/>
-            <w:tcMar>
-              <w:top w:w="100" w:type="dxa"/>
-              <w:start w:w="120" w:type="dxa"/>
-              <w:bottom w:w="100" w:type="dxa"/>
-              <w:end w:w="120" w:type="dxa"/>
-            </w:tcMar>
-            <w:vAlign w:val="center"/>
-            <w:shd w:fill="F2F4F7"/>
-          </w:tcPr>
-          <w:p>
-            <w:pPr>
-              <w:spacing w:after="0"/>
-              <w:jc w:val="center"/>
-            </w:pPr>
-            <w:r>
-              <w:rPr>
-                <w:rFonts w:ascii="Calibri" w:hAnsi="Calibri"/>
-                <w:b w:val="0"/>
-                <w:i w:val="0"/>
-                <w:color w:val="000000"/>
-                <w:sz w:val="19"/>
-              </w:rPr>
-              <w:t>kategori_produk_encoded</w:t>
-            </w:r>
-          </w:p>
-        </w:tc>
-        <w:tc>
-          <w:tcPr>
-            <w:tcW w:type="dxa" w:w="4896"/>
-            <w:tcMar>
-              <w:top w:w="100" w:type="dxa"/>
-              <w:start w:w="120" w:type="dxa"/>
-              <w:bottom w:w="100" w:type="dxa"/>
-              <w:end w:w="120" w:type="dxa"/>
-            </w:tcMar>
-            <w:vAlign w:val="center"/>
-            <w:shd w:fill="F2F4F7"/>
-          </w:tcPr>
-          <w:p>
-            <w:pPr>
-              <w:spacing w:after="0"/>
-              <w:jc w:val="center"/>
-            </w:pPr>
-            <w:r>
-              <w:rPr>
-                <w:rFonts w:ascii="Calibri" w:hAnsi="Calibri"/>
-                <w:b w:val="0"/>
-                <w:i w:val="0"/>
-                <w:color w:val="000000"/>
-                <w:sz w:val="19"/>
-              </w:rPr>
-              <w:t>Kategori produk yang telah diubah menjadi angka</w:t>
+              <w:t>Kategori produk yang telah diubah menggunakan LabelEncoder</w:t>
             </w:r>
           </w:p>
         </w:tc>
@@ -2860,7 +2771,7 @@
                 <w:color w:val="24292F"/>
                 <w:sz w:val="17"/>
               </w:rPr>
-              <w:t>X_train, X_test, y_train, y_test = train_test_split(</w:t>
+              <w:t># Urutkan data secara kronologis</w:t>
             </w:r>
             <w:r>
               <w:br/>
@@ -2873,7 +2784,7 @@
                 <w:color w:val="24292F"/>
                 <w:sz w:val="17"/>
               </w:rPr>
-              <w:t xml:space="preserve">    X, y, test_size=0.2, random_state=42</w:t>
+              <w:t>df = df.sort_values(by='tanggal_transaksi')</w:t>
             </w:r>
             <w:r>
               <w:br/>
@@ -2886,7 +2797,46 @@
                 <w:color w:val="24292F"/>
                 <w:sz w:val="17"/>
               </w:rPr>
-              <w:t>)</w:t>
+              <w:t># Bagi data dengan rasio 80:20 secara manual</w:t>
+            </w:r>
+            <w:r>
+              <w:br/>
+            </w:r>
+            <w:r>
+              <w:rPr>
+                <w:rFonts w:ascii="Consolas" w:hAnsi="Consolas"/>
+                <w:b w:val="0"/>
+                <w:i w:val="0"/>
+                <w:color w:val="24292F"/>
+                <w:sz w:val="17"/>
+              </w:rPr>
+              <w:t>split_index = int(len(X) * 0.8)</w:t>
+            </w:r>
+            <w:r>
+              <w:br/>
+            </w:r>
+            <w:r>
+              <w:rPr>
+                <w:rFonts w:ascii="Consolas" w:hAnsi="Consolas"/>
+                <w:b w:val="0"/>
+                <w:i w:val="0"/>
+                <w:color w:val="24292F"/>
+                <w:sz w:val="17"/>
+              </w:rPr>
+              <w:t>X_train, X_test = X.iloc[:split_index], X.iloc[split_index:]</w:t>
+            </w:r>
+            <w:r>
+              <w:br/>
+            </w:r>
+            <w:r>
+              <w:rPr>
+                <w:rFonts w:ascii="Consolas" w:hAnsi="Consolas"/>
+                <w:b w:val="0"/>
+                <w:i w:val="0"/>
+                <w:color w:val="24292F"/>
+                <w:sz w:val="17"/>
+              </w:rPr>
+              <w:t>y_train, y_test = y.iloc[:split_index], y.iloc[split_index:]</w:t>
             </w:r>
           </w:p>
         </w:tc>
@@ -2907,7 +2857,7 @@
           <w:color w:val="000000"/>
           <w:sz w:val="22"/>
         </w:rPr>
-        <w:t>Parameter test_size=0.2 berarti 20% data digunakan untuk testing. Parameter random_state=42 membuat pembagian acak selalu sama ketika program dijalankan ulang, sehingga hasil pengujian dapat direproduksi.</w:t>
+        <w:t>Pembagian data dilakukan secara kronologis berdasarkan urutan tanggal transaksi. Parameter split_index diambil dari 80% panjang dataset bersih (6.741 data), yaitu int(6741 * 0.8) = 5.392 data training, dan sisa 1.349 data digunakan sebagai testing. Metode ini memastikan bahwa model diuji untuk memprediksi permintaan di masa depan, bukan sekadar memprediksi data acak di masa lalu.</w:t>
       </w:r>
     </w:p>
     <w:tbl>
@@ -2944,7 +2894,7 @@
                 <w:color w:val="7A5A00"/>
                 <w:sz w:val="22"/>
               </w:rPr>
-              <w:t>Catatan untuk Data Berdasarkan Waktu</w:t>
+              <w:t>Pemberitahuan Metodologi</w:t>
             </w:r>
           </w:p>
           <w:p>
@@ -2959,7 +2909,7 @@
                 <w:color w:val="000000"/>
                 <w:sz w:val="21"/>
               </w:rPr>
-              <w:t>Karena tujuan sistem adalah memprediksi masa depan, pembagian data secara kronologis lebih kuat daripada pembagian acak. Data lama sebaiknya digunakan sebagai training dan data terbaru sebagai testing.</w:t>
+              <w:t>Pengujian model menggunakan pembagian kronologis (chronological split) sangat penting untuk data deret waktu (time series) guna menghindari data leakage temporal, di mana model tidak sengaja mempelajari data masa depan.</w:t>
             </w:r>
           </w:p>
         </w:tc>
@@ -4686,7 +4636,7 @@
           <w:color w:val="000000"/>
           <w:sz w:val="22"/>
         </w:rPr>
-        <w:t>Pada testing set terdapat 1.349 data. Rata-rata target testing adalah sekitar 4,9622 unit, sedangkan total variasi aktual atau SST adalah 5.133,0719.</w:t>
+        <w:t>Pada testing set terdapat 1.349 data. Rata-rata target testing adalah sekitar 5,4188 unit, sedangkan total variasi aktual atau SST adalah 10.964,3617.</w:t>
       </w:r>
     </w:p>
     <w:p>
@@ -4832,7 +4782,7 @@
                 <w:color w:val="000000"/>
                 <w:sz w:val="19"/>
               </w:rPr>
-              <w:t>848,4592</w:t>
+              <w:t>3.357,4719</w:t>
             </w:r>
           </w:p>
         </w:tc>
@@ -4892,7 +4842,7 @@
                 <w:color w:val="000000"/>
                 <w:sz w:val="19"/>
               </w:rPr>
-              <w:t>1.122,3551</w:t>
+              <w:t>11.007,5413</w:t>
             </w:r>
           </w:p>
         </w:tc>
@@ -5010,7 +4960,7 @@
                 <w:color w:val="000000"/>
                 <w:sz w:val="19"/>
               </w:rPr>
-              <w:t>5.133,0719</w:t>
+              <w:t>10.964,3617</w:t>
             </w:r>
           </w:p>
         </w:tc>
@@ -5034,7 +4984,7 @@
           <w:color w:val="17365D"/>
           <w:sz w:val="23"/>
         </w:rPr>
-        <w:t>MAE = 848,4592 / 1.349 = 0,6290 ≈ 0,63</w:t>
+        <w:t>MAE = 3.357,4719 / 1.349 = 2,4889 ≈ 2,49</w:t>
       </w:r>
     </w:p>
     <w:p>
@@ -5050,7 +5000,7 @@
           <w:color w:val="17365D"/>
           <w:sz w:val="23"/>
         </w:rPr>
-        <w:t>RMSE = √(1.122,3551 / 1.349) = 0,9121 ≈ 0,91</w:t>
+        <w:t>RMSE = √(11.007,5413 / 1.349) = 2,8565 ≈ 2,86</w:t>
       </w:r>
     </w:p>
     <w:p>
@@ -5066,7 +5016,7 @@
           <w:color w:val="17365D"/>
           <w:sz w:val="23"/>
         </w:rPr>
-        <w:t>R² = 1 - (1.122,3551 / 5.133,0719) = 0,7813</w:t>
+        <w:t>R² = 1 - (11.007,5413 / 10.964,3617) = -0,0039</w:t>
       </w:r>
     </w:p>
     <w:p>
@@ -5079,7 +5029,7 @@
           <w:color w:val="000000"/>
           <w:sz w:val="22"/>
         </w:rPr>
-        <w:t>Interpretasinya, Linear Regression menjelaskan sekitar 78,13% variasi target pada testing set dan rata-rata prediksinya meleset sekitar 0,63 unit.</w:t>
+        <w:t>Interpretasinya, Linear Regression tidak mampu menjelaskan variasi target pada testing set secara optimal (R² bernilai negatif sebesar -0,0039 atau -0,39%) dan rata-rata prediksinya meleset sekitar 2,49 unit.</w:t>
       </w:r>
     </w:p>
     <w:p>
@@ -5225,7 +5175,7 @@
                 <w:color w:val="000000"/>
                 <w:sz w:val="19"/>
               </w:rPr>
-              <w:t>39,86</w:t>
+              <w:t>3.494,5478</w:t>
             </w:r>
           </w:p>
         </w:tc>
@@ -5285,7 +5235,7 @@
                 <w:color w:val="000000"/>
                 <w:sz w:val="19"/>
               </w:rPr>
-              <w:t>18,7142</w:t>
+              <w:t>12.431,3712</w:t>
             </w:r>
           </w:p>
         </w:tc>
@@ -5403,7 +5353,7 @@
                 <w:color w:val="000000"/>
                 <w:sz w:val="19"/>
               </w:rPr>
-              <w:t>5.133,0719</w:t>
+              <w:t>10.964,3617</w:t>
             </w:r>
           </w:p>
         </w:tc>
@@ -5427,7 +5377,7 @@
           <w:color w:val="17365D"/>
           <w:sz w:val="23"/>
         </w:rPr>
-        <w:t>MAE = 39,86 / 1.349 = 0,0295 ≈ 0,03</w:t>
+        <w:t>MAE = 3.494,5478 / 1.349 = 2,5905 ≈ 2,59</w:t>
       </w:r>
     </w:p>
     <w:p>
@@ -5443,7 +5393,7 @@
           <w:color w:val="17365D"/>
           <w:sz w:val="23"/>
         </w:rPr>
-        <w:t>RMSE = √(18,7142 / 1.349) = 0,1178 ≈ 0,12</w:t>
+        <w:t>RMSE = √(12.431,3712 / 1.349) = 3,0357 ≈ 3,04</w:t>
       </w:r>
     </w:p>
     <w:p>
@@ -5459,7 +5409,7 @@
           <w:color w:val="17365D"/>
           <w:sz w:val="23"/>
         </w:rPr>
-        <w:t>R² = 1 - (18,7142 / 5.133,0719) = 0,9964</w:t>
+        <w:t>R² = 1 - (12.431,3712 / 10.964,3617) = -0,1338</w:t>
       </w:r>
     </w:p>
     <w:p>
@@ -5472,7 +5422,7 @@
           <w:color w:val="000000"/>
           <w:sz w:val="22"/>
         </w:rPr>
-        <w:t>Interpretasinya, Random Forest menjelaskan sekitar 99,64% variasi target pada testing set dan rata-rata prediksinya meleset sekitar 0,03 unit. Angka ini harus dibaca bersama analisis data leakage pada bagian berikutnya.</w:t>
+        <w:t>Interpretasinya, Random Forest tidak mampu menjelaskan variasi target pada testing set secara optimal (R² bernilai negatif sebesar -0,1338 atau -13,38%) dan rata-rata prediksinya meleset sekitar 2,59 unit setelah fitur total_harga_update yang menimbulkan data leakage dihapus.</w:t>
       </w:r>
     </w:p>
     <w:p>
@@ -5650,7 +5600,7 @@
                 <w:color w:val="000000"/>
                 <w:sz w:val="18"/>
               </w:rPr>
-              <w:t>4</w:t>
+              <w:t>7</w:t>
             </w:r>
           </w:p>
         </w:tc>
@@ -5678,7 +5628,7 @@
                 <w:color w:val="000000"/>
                 <w:sz w:val="18"/>
               </w:rPr>
-              <w:t>3,5472</w:t>
+              <w:t>5,4795</w:t>
             </w:r>
           </w:p>
         </w:tc>
@@ -5706,7 +5656,7 @@
                 <w:color w:val="000000"/>
                 <w:sz w:val="18"/>
               </w:rPr>
-              <w:t>4,01</w:t>
+              <w:t>3,71</w:t>
             </w:r>
           </w:p>
         </w:tc>
@@ -5720,6 +5670,124 @@
               <w:end w:w="120" w:type="dxa"/>
             </w:tcMar>
             <w:vAlign w:val="center"/>
+          </w:tcPr>
+          <w:p>
+            <w:pPr>
+              <w:spacing w:after="0"/>
+              <w:jc w:val="center"/>
+            </w:pPr>
+            <w:r>
+              <w:rPr>
+                <w:rFonts w:ascii="Calibri" w:hAnsi="Calibri"/>
+                <w:b w:val="0"/>
+                <w:i w:val="0"/>
+                <w:color w:val="000000"/>
+                <w:sz w:val="18"/>
+              </w:rPr>
+              <w:t>3,29</w:t>
+            </w:r>
+          </w:p>
+        </w:tc>
+      </w:tr>
+      <w:tr>
+        <w:tc>
+          <w:tcPr>
+            <w:tcW w:type="dxa" w:w="1296"/>
+            <w:tcMar>
+              <w:top w:w="100" w:type="dxa"/>
+              <w:start w:w="120" w:type="dxa"/>
+              <w:bottom w:w="100" w:type="dxa"/>
+              <w:end w:w="120" w:type="dxa"/>
+            </w:tcMar>
+            <w:vAlign w:val="center"/>
+            <w:shd w:fill="F2F4F7"/>
+          </w:tcPr>
+          <w:p>
+            <w:pPr>
+              <w:spacing w:after="0"/>
+              <w:jc w:val="left"/>
+            </w:pPr>
+            <w:r>
+              <w:rPr>
+                <w:rFonts w:ascii="Calibri" w:hAnsi="Calibri"/>
+                <w:b w:val="0"/>
+                <w:i w:val="0"/>
+                <w:color w:val="000000"/>
+                <w:sz w:val="18"/>
+              </w:rPr>
+              <w:t>5</w:t>
+            </w:r>
+          </w:p>
+        </w:tc>
+        <w:tc>
+          <w:tcPr>
+            <w:tcW w:type="dxa" w:w="2880"/>
+            <w:tcMar>
+              <w:top w:w="100" w:type="dxa"/>
+              <w:start w:w="120" w:type="dxa"/>
+              <w:bottom w:w="100" w:type="dxa"/>
+              <w:end w:w="120" w:type="dxa"/>
+            </w:tcMar>
+            <w:vAlign w:val="center"/>
+            <w:shd w:fill="F2F4F7"/>
+          </w:tcPr>
+          <w:p>
+            <w:pPr>
+              <w:spacing w:after="0"/>
+              <w:jc w:val="center"/>
+            </w:pPr>
+            <w:r>
+              <w:rPr>
+                <w:rFonts w:ascii="Calibri" w:hAnsi="Calibri"/>
+                <w:b w:val="0"/>
+                <w:i w:val="0"/>
+                <w:color w:val="000000"/>
+                <w:sz w:val="18"/>
+              </w:rPr>
+              <w:t>5,5121</w:t>
+            </w:r>
+          </w:p>
+        </w:tc>
+        <w:tc>
+          <w:tcPr>
+            <w:tcW w:type="dxa" w:w="2880"/>
+            <w:tcMar>
+              <w:top w:w="100" w:type="dxa"/>
+              <w:start w:w="120" w:type="dxa"/>
+              <w:bottom w:w="100" w:type="dxa"/>
+              <w:end w:w="120" w:type="dxa"/>
+            </w:tcMar>
+            <w:vAlign w:val="center"/>
+            <w:shd w:fill="F2F4F7"/>
+          </w:tcPr>
+          <w:p>
+            <w:pPr>
+              <w:spacing w:after="0"/>
+              <w:jc w:val="center"/>
+            </w:pPr>
+            <w:r>
+              <w:rPr>
+                <w:rFonts w:ascii="Calibri" w:hAnsi="Calibri"/>
+                <w:b w:val="0"/>
+                <w:i w:val="0"/>
+                <w:color w:val="000000"/>
+                <w:sz w:val="18"/>
+              </w:rPr>
+              <w:t>4,99</w:t>
+            </w:r>
+          </w:p>
+        </w:tc>
+        <w:tc>
+          <w:tcPr>
+            <w:tcW w:type="dxa" w:w="2016"/>
+            <w:tcMar>
+              <w:top w:w="100" w:type="dxa"/>
+              <w:start w:w="120" w:type="dxa"/>
+              <w:bottom w:w="100" w:type="dxa"/>
+              <w:end w:w="120" w:type="dxa"/>
+            </w:tcMar>
+            <w:vAlign w:val="center"/>
+            <w:shd w:fill="F2F4F7"/>
           </w:tcPr>
           <w:p>
             <w:pPr>
@@ -5750,7 +5818,6 @@
               <w:end w:w="120" w:type="dxa"/>
             </w:tcMar>
             <w:vAlign w:val="center"/>
-            <w:shd w:fill="F2F4F7"/>
           </w:tcPr>
           <w:p>
             <w:pPr>
@@ -5765,124 +5832,7 @@
                 <w:color w:val="000000"/>
                 <w:sz w:val="18"/>
               </w:rPr>
-              <w:t>3</w:t>
-            </w:r>
-          </w:p>
-        </w:tc>
-        <w:tc>
-          <w:tcPr>
-            <w:tcW w:type="dxa" w:w="2880"/>
-            <w:tcMar>
-              <w:top w:w="100" w:type="dxa"/>
-              <w:start w:w="120" w:type="dxa"/>
-              <w:bottom w:w="100" w:type="dxa"/>
-              <w:end w:w="120" w:type="dxa"/>
-            </w:tcMar>
-            <w:vAlign w:val="center"/>
-            <w:shd w:fill="F2F4F7"/>
-          </w:tcPr>
-          <w:p>
-            <w:pPr>
-              <w:spacing w:after="0"/>
-              <w:jc w:val="center"/>
-            </w:pPr>
-            <w:r>
-              <w:rPr>
-                <w:rFonts w:ascii="Calibri" w:hAnsi="Calibri"/>
-                <w:b w:val="0"/>
-                <w:i w:val="0"/>
-                <w:color w:val="000000"/>
-                <w:sz w:val="18"/>
-              </w:rPr>
-              <w:t>2,5369</w:t>
-            </w:r>
-          </w:p>
-        </w:tc>
-        <w:tc>
-          <w:tcPr>
-            <w:tcW w:type="dxa" w:w="2880"/>
-            <w:tcMar>
-              <w:top w:w="100" w:type="dxa"/>
-              <w:start w:w="120" w:type="dxa"/>
-              <w:bottom w:w="100" w:type="dxa"/>
-              <w:end w:w="120" w:type="dxa"/>
-            </w:tcMar>
-            <w:vAlign w:val="center"/>
-            <w:shd w:fill="F2F4F7"/>
-          </w:tcPr>
-          <w:p>
-            <w:pPr>
-              <w:spacing w:after="0"/>
-              <w:jc w:val="center"/>
-            </w:pPr>
-            <w:r>
-              <w:rPr>
-                <w:rFonts w:ascii="Calibri" w:hAnsi="Calibri"/>
-                <w:b w:val="0"/>
-                <w:i w:val="0"/>
-                <w:color w:val="000000"/>
-                <w:sz w:val="18"/>
-              </w:rPr>
-              <w:t>3,00</w:t>
-            </w:r>
-          </w:p>
-        </w:tc>
-        <w:tc>
-          <w:tcPr>
-            <w:tcW w:type="dxa" w:w="2016"/>
-            <w:tcMar>
-              <w:top w:w="100" w:type="dxa"/>
-              <w:start w:w="120" w:type="dxa"/>
-              <w:bottom w:w="100" w:type="dxa"/>
-              <w:end w:w="120" w:type="dxa"/>
-            </w:tcMar>
-            <w:vAlign w:val="center"/>
-            <w:shd w:fill="F2F4F7"/>
-          </w:tcPr>
-          <w:p>
-            <w:pPr>
-              <w:spacing w:after="0"/>
-              <w:jc w:val="center"/>
-            </w:pPr>
-            <w:r>
-              <w:rPr>
-                <w:rFonts w:ascii="Calibri" w:hAnsi="Calibri"/>
-                <w:b w:val="0"/>
-                <w:i w:val="0"/>
-                <w:color w:val="000000"/>
-                <w:sz w:val="18"/>
-              </w:rPr>
-              <w:t>0,00</w:t>
-            </w:r>
-          </w:p>
-        </w:tc>
-      </w:tr>
-      <w:tr>
-        <w:tc>
-          <w:tcPr>
-            <w:tcW w:type="dxa" w:w="1296"/>
-            <w:tcMar>
-              <w:top w:w="100" w:type="dxa"/>
-              <w:start w:w="120" w:type="dxa"/>
-              <w:bottom w:w="100" w:type="dxa"/>
-              <w:end w:w="120" w:type="dxa"/>
-            </w:tcMar>
-            <w:vAlign w:val="center"/>
-          </w:tcPr>
-          <w:p>
-            <w:pPr>
-              <w:spacing w:after="0"/>
-              <w:jc w:val="left"/>
-            </w:pPr>
-            <w:r>
-              <w:rPr>
-                <w:rFonts w:ascii="Calibri" w:hAnsi="Calibri"/>
-                <w:b w:val="0"/>
-                <w:i w:val="0"/>
-                <w:color w:val="000000"/>
-                <w:sz w:val="18"/>
-              </w:rPr>
-              <w:t>4</w:t>
+              <w:t>10</w:t>
             </w:r>
           </w:p>
         </w:tc>
@@ -5910,7 +5860,7 @@
                 <w:color w:val="000000"/>
                 <w:sz w:val="18"/>
               </w:rPr>
-              <w:t>4,4879</w:t>
+              <w:t>5,5587</w:t>
             </w:r>
           </w:p>
         </w:tc>
@@ -5938,7 +5888,7 @@
                 <w:color w:val="000000"/>
                 <w:sz w:val="18"/>
               </w:rPr>
-              <w:t>4,00</w:t>
+              <w:t>5,04</w:t>
             </w:r>
           </w:p>
         </w:tc>
@@ -5966,7 +5916,7 @@
                 <w:color w:val="000000"/>
                 <w:sz w:val="18"/>
               </w:rPr>
-              <w:t>0,00</w:t>
+              <w:t>4,96</w:t>
             </w:r>
           </w:p>
         </w:tc>
@@ -5997,7 +5947,7 @@
                 <w:color w:val="000000"/>
                 <w:sz w:val="18"/>
               </w:rPr>
-              <w:t>2</w:t>
+              <w:t>1</w:t>
             </w:r>
           </w:p>
         </w:tc>
@@ -6026,7 +5976,7 @@
                 <w:color w:val="000000"/>
                 <w:sz w:val="18"/>
               </w:rPr>
-              <w:t>0,7336</w:t>
+              <w:t>5,4686</w:t>
             </w:r>
           </w:p>
         </w:tc>
@@ -6055,7 +6005,7 @@
                 <w:color w:val="000000"/>
                 <w:sz w:val="18"/>
               </w:rPr>
-              <w:t>2,00</w:t>
+              <w:t>5,67</w:t>
             </w:r>
           </w:p>
         </w:tc>
@@ -6084,7 +6034,7 @@
                 <w:color w:val="000000"/>
                 <w:sz w:val="18"/>
               </w:rPr>
-              <w:t>0,00</w:t>
+              <w:t>4,67</w:t>
             </w:r>
           </w:p>
         </w:tc>
@@ -6114,7 +6064,7 @@
                 <w:color w:val="000000"/>
                 <w:sz w:val="18"/>
               </w:rPr>
-              <w:t>7</w:t>
+              <w:t>2</w:t>
             </w:r>
           </w:p>
         </w:tc>
@@ -6142,7 +6092,7 @@
                 <w:color w:val="000000"/>
                 <w:sz w:val="18"/>
               </w:rPr>
-              <w:t>7,2195</w:t>
+              <w:t>5,4883</w:t>
             </w:r>
           </w:p>
         </w:tc>
@@ -6170,7 +6120,7 @@
                 <w:color w:val="000000"/>
                 <w:sz w:val="18"/>
               </w:rPr>
-              <w:t>7,00</w:t>
+              <w:t>5,64</w:t>
             </w:r>
           </w:p>
         </w:tc>
@@ -6198,7 +6148,7 @@
                 <w:color w:val="000000"/>
                 <w:sz w:val="18"/>
               </w:rPr>
-              <w:t>0,00</w:t>
+              <w:t>3,64</w:t>
             </w:r>
           </w:p>
         </w:tc>
@@ -6382,7 +6332,7 @@
                 <w:color w:val="000000"/>
                 <w:sz w:val="19"/>
               </w:rPr>
-              <w:t>0,7813</w:t>
+              <w:t>-0,0039</w:t>
             </w:r>
           </w:p>
         </w:tc>
@@ -6410,7 +6360,7 @@
                 <w:color w:val="000000"/>
                 <w:sz w:val="19"/>
               </w:rPr>
-              <w:t>0,9964</w:t>
+              <w:t>-0,1338</w:t>
             </w:r>
           </w:p>
         </w:tc>
@@ -6470,7 +6420,7 @@
                 <w:color w:val="000000"/>
                 <w:sz w:val="19"/>
               </w:rPr>
-              <w:t>0,63 unit</w:t>
+              <w:t>2,49 unit</w:t>
             </w:r>
           </w:p>
         </w:tc>
@@ -6499,7 +6449,7 @@
                 <w:color w:val="000000"/>
                 <w:sz w:val="19"/>
               </w:rPr>
-              <w:t>0,03 unit</w:t>
+              <w:t>2,59 unit</w:t>
             </w:r>
           </w:p>
         </w:tc>
@@ -6557,7 +6507,7 @@
                 <w:color w:val="000000"/>
                 <w:sz w:val="19"/>
               </w:rPr>
-              <w:t>0,91 unit</w:t>
+              <w:t>2,86 unit</w:t>
             </w:r>
           </w:p>
         </w:tc>
@@ -6585,7 +6535,7 @@
                 <w:color w:val="000000"/>
                 <w:sz w:val="19"/>
               </w:rPr>
-              <w:t>0,12 unit</w:t>
+              <w:t>3,04 unit</w:t>
             </w:r>
           </w:p>
         </w:tc>
@@ -6674,7 +6624,7 @@
                 <w:color w:val="000000"/>
                 <w:sz w:val="19"/>
               </w:rPr>
-              <w:t>Baik</w:t>
+              <w:t>Baik (pada data training)</w:t>
             </w:r>
           </w:p>
         </w:tc>
@@ -6791,7 +6741,7 @@
                 <w:color w:val="000000"/>
                 <w:sz w:val="19"/>
               </w:rPr>
-              <w:t>Risiko pada hasil proyek</w:t>
+              <w:t>Ketergantungan data leakage</w:t>
             </w:r>
           </w:p>
         </w:tc>
@@ -6820,7 +6770,7 @@
                 <w:color w:val="000000"/>
                 <w:sz w:val="19"/>
               </w:rPr>
-              <w:t>Terpengaruh leakage</w:t>
+              <w:t>Bebas leakage (total harga dihapus)</w:t>
             </w:r>
           </w:p>
         </w:tc>
@@ -6849,7 +6799,7 @@
                 <w:color w:val="000000"/>
                 <w:sz w:val="19"/>
               </w:rPr>
-              <w:t>Sangat terpengaruh leakage</w:t>
+              <w:t>Bebas leakage (total harga dihapus)</w:t>
             </w:r>
           </w:p>
         </w:tc>
@@ -6881,7 +6831,7 @@
           <w:color w:val="17365D"/>
           <w:sz w:val="23"/>
         </w:rPr>
-        <w:t>Penurunan MAE = [(0,6290 - 0,0295) / 0,6290] x 100% = 95,3%</w:t>
+        <w:t>Peningkatan MAE = [(2,5905 - 2,4889) / 2,4889] x 100% = 4,08%</w:t>
       </w:r>
     </w:p>
     <w:p>
@@ -6894,7 +6844,7 @@
           <w:color w:val="000000"/>
           <w:sz w:val="22"/>
         </w:rPr>
-        <w:t>Pernyataan yang tepat adalah Random Forest mengurangi MAE sekitar 95,3% dibandingkan Linear Regression pada test set saat ini. Pernyataan tersebut tidak sama dengan mengatakan model 95,3% lebih akurat.</w:t>
+        <w:t>Pernyataan yang tepat adalah model Random Forest menghasilkan kesalahan rata-rata yang sedikit lebih tinggi (+4,08%) dibandingkan Linear Regression pada test set aktual tanpa leakage.</w:t>
       </w:r>
     </w:p>
     <w:p>
@@ -7100,7 +7050,7 @@
                 <w:color w:val="000000"/>
                 <w:sz w:val="19"/>
               </w:rPr>
-              <w:t>0,7902</w:t>
+              <w:t>0,0013</w:t>
             </w:r>
           </w:p>
         </w:tc>
@@ -7128,7 +7078,7 @@
                 <w:color w:val="000000"/>
                 <w:sz w:val="19"/>
               </w:rPr>
-              <w:t>0,7813</w:t>
+              <w:t>-0,0039</w:t>
             </w:r>
           </w:p>
         </w:tc>
@@ -7156,7 +7106,7 @@
                 <w:color w:val="000000"/>
                 <w:sz w:val="19"/>
               </w:rPr>
-              <w:t>0,0089</w:t>
+              <w:t>0,0052</w:t>
             </w:r>
           </w:p>
         </w:tc>
@@ -7216,7 +7166,7 @@
                 <w:color w:val="000000"/>
                 <w:sz w:val="19"/>
               </w:rPr>
-              <w:t>0,9995</w:t>
+              <w:t>0,6913</w:t>
             </w:r>
           </w:p>
         </w:tc>
@@ -7245,7 +7195,7 @@
                 <w:color w:val="000000"/>
                 <w:sz w:val="19"/>
               </w:rPr>
-              <w:t>0,9964</w:t>
+              <w:t>-0,1338</w:t>
             </w:r>
           </w:p>
         </w:tc>
@@ -7274,7 +7224,7 @@
                 <w:color w:val="000000"/>
                 <w:sz w:val="19"/>
               </w:rPr>
-              <w:t>0,0031</w:t>
+              <w:t>0,8251</w:t>
             </w:r>
           </w:p>
         </w:tc>
@@ -7295,7 +7245,7 @@
           <w:color w:val="000000"/>
           <w:sz w:val="22"/>
         </w:rPr>
-        <w:t>Selisih training dan testing terlihat kecil sehingga secara angka awal model tampak stabil. Namun, kestabilan ini tidak membatalkan masalah data leakage karena informasi target tersedia pada kedua kelompok data melalui total harga.</w:t>
+        <w:t>Selisih training dan testing pada Linear Regression terlihat sangat kecil, namun kedua nilainya mendekati nol, menunjukkan underfitting. Sedangkan pada Random Forest, terdapat selisih R² yang sangat besar (0,8251) antara training (0,6913) dan testing (-0,1338). Hal ini menunjukkan indikasi overfitting yang sangat kuat pada Random Forest setelah total harga dihapus dari fitur. Model berkinerja cukup baik pada data training namun gagal memprediksi data testing baru yang belum pernah dilihat sebelumnya.</w:t>
       </w:r>
     </w:p>
     <w:p>
@@ -8042,7 +7992,7 @@
                 <w:color w:val="000000"/>
                 <w:sz w:val="17"/>
               </w:rPr>
-              <w:t>Random split tanpa total harga</w:t>
+              <w:t>Chronological split tanpa total harga (backend Railway)</w:t>
             </w:r>
           </w:p>
         </w:tc>
@@ -8098,7 +8048,7 @@
                 <w:color w:val="000000"/>
                 <w:sz w:val="17"/>
               </w:rPr>
-              <w:t>-0,0045</w:t>
+              <w:t>-0,0039</w:t>
             </w:r>
           </w:p>
         </w:tc>
@@ -8126,7 +8076,7 @@
                 <w:color w:val="000000"/>
                 <w:sz w:val="17"/>
               </w:rPr>
-              <w:t>1,53</w:t>
+              <w:t>2,49</w:t>
             </w:r>
           </w:p>
         </w:tc>
@@ -8154,7 +8104,7 @@
                 <w:color w:val="000000"/>
                 <w:sz w:val="17"/>
               </w:rPr>
-              <w:t>1,96</w:t>
+              <w:t>2,86</w:t>
             </w:r>
           </w:p>
         </w:tc>
@@ -8185,7 +8135,7 @@
                 <w:color w:val="000000"/>
                 <w:sz w:val="17"/>
               </w:rPr>
-              <w:t>Random split tanpa total harga</w:t>
+              <w:t>Chronological split tanpa total harga (backend Railway)</w:t>
             </w:r>
           </w:p>
         </w:tc>
@@ -8243,7 +8193,7 @@
                 <w:color w:val="000000"/>
                 <w:sz w:val="17"/>
               </w:rPr>
-              <w:t>-0,1124</w:t>
+              <w:t>-0,1338</w:t>
             </w:r>
           </w:p>
         </w:tc>
@@ -8272,7 +8222,7 @@
                 <w:color w:val="000000"/>
                 <w:sz w:val="17"/>
               </w:rPr>
-              <w:t>1,64</w:t>
+              <w:t>2,59</w:t>
             </w:r>
           </w:p>
         </w:tc>
@@ -8301,296 +8251,7 @@
                 <w:color w:val="000000"/>
                 <w:sz w:val="17"/>
               </w:rPr>
-              <w:t>2,06</w:t>
-            </w:r>
-          </w:p>
-        </w:tc>
-      </w:tr>
-      <w:tr>
-        <w:tc>
-          <w:tcPr>
-            <w:tcW w:type="dxa" w:w="3312"/>
-            <w:tcMar>
-              <w:top w:w="100" w:type="dxa"/>
-              <w:start w:w="120" w:type="dxa"/>
-              <w:bottom w:w="100" w:type="dxa"/>
-              <w:end w:w="120" w:type="dxa"/>
-            </w:tcMar>
-            <w:vAlign w:val="center"/>
-          </w:tcPr>
-          <w:p>
-            <w:pPr>
-              <w:spacing w:after="0"/>
-              <w:jc w:val="left"/>
-            </w:pPr>
-            <w:r>
-              <w:rPr>
-                <w:rFonts w:ascii="Calibri" w:hAnsi="Calibri"/>
-                <w:b w:val="0"/>
-                <w:i w:val="0"/>
-                <w:color w:val="000000"/>
-                <w:sz w:val="17"/>
-              </w:rPr>
-              <w:t>Chronological split tanpa total harga</w:t>
-            </w:r>
-          </w:p>
-        </w:tc>
-        <w:tc>
-          <w:tcPr>
-            <w:tcW w:type="dxa" w:w="2304"/>
-            <w:tcMar>
-              <w:top w:w="100" w:type="dxa"/>
-              <w:start w:w="120" w:type="dxa"/>
-              <w:bottom w:w="100" w:type="dxa"/>
-              <w:end w:w="120" w:type="dxa"/>
-            </w:tcMar>
-            <w:vAlign w:val="center"/>
-          </w:tcPr>
-          <w:p>
-            <w:pPr>
-              <w:spacing w:after="0"/>
-              <w:jc w:val="center"/>
-            </w:pPr>
-            <w:r>
-              <w:rPr>
-                <w:rFonts w:ascii="Calibri" w:hAnsi="Calibri"/>
-                <w:b w:val="0"/>
-                <w:i w:val="0"/>
-                <w:color w:val="000000"/>
-                <w:sz w:val="17"/>
-              </w:rPr>
-              <w:t>Linear Regression</w:t>
-            </w:r>
-          </w:p>
-        </w:tc>
-        <w:tc>
-          <w:tcPr>
-            <w:tcW w:type="dxa" w:w="1152"/>
-            <w:tcMar>
-              <w:top w:w="100" w:type="dxa"/>
-              <w:start w:w="120" w:type="dxa"/>
-              <w:bottom w:w="100" w:type="dxa"/>
-              <w:end w:w="120" w:type="dxa"/>
-            </w:tcMar>
-            <w:vAlign w:val="center"/>
-          </w:tcPr>
-          <w:p>
-            <w:pPr>
-              <w:spacing w:after="0"/>
-              <w:jc w:val="center"/>
-            </w:pPr>
-            <w:r>
-              <w:rPr>
-                <w:rFonts w:ascii="Calibri" w:hAnsi="Calibri"/>
-                <w:b w:val="0"/>
-                <w:i w:val="0"/>
-                <w:color w:val="000000"/>
-                <w:sz w:val="17"/>
-              </w:rPr>
-              <w:t>-0,0025</w:t>
-            </w:r>
-          </w:p>
-        </w:tc>
-        <w:tc>
-          <w:tcPr>
-            <w:tcW w:type="dxa" w:w="1152"/>
-            <w:tcMar>
-              <w:top w:w="100" w:type="dxa"/>
-              <w:start w:w="120" w:type="dxa"/>
-              <w:bottom w:w="100" w:type="dxa"/>
-              <w:end w:w="120" w:type="dxa"/>
-            </w:tcMar>
-            <w:vAlign w:val="center"/>
-          </w:tcPr>
-          <w:p>
-            <w:pPr>
-              <w:spacing w:after="0"/>
-              <w:jc w:val="center"/>
-            </w:pPr>
-            <w:r>
-              <w:rPr>
-                <w:rFonts w:ascii="Calibri" w:hAnsi="Calibri"/>
-                <w:b w:val="0"/>
-                <w:i w:val="0"/>
-                <w:color w:val="000000"/>
-                <w:sz w:val="17"/>
-              </w:rPr>
-              <w:t>1,57</w:t>
-            </w:r>
-          </w:p>
-        </w:tc>
-        <w:tc>
-          <w:tcPr>
-            <w:tcW w:type="dxa" w:w="1152"/>
-            <w:tcMar>
-              <w:top w:w="100" w:type="dxa"/>
-              <w:start w:w="120" w:type="dxa"/>
-              <w:bottom w:w="100" w:type="dxa"/>
-              <w:end w:w="120" w:type="dxa"/>
-            </w:tcMar>
-            <w:vAlign w:val="center"/>
-          </w:tcPr>
-          <w:p>
-            <w:pPr>
-              <w:spacing w:after="0"/>
-              <w:jc w:val="center"/>
-            </w:pPr>
-            <w:r>
-              <w:rPr>
-                <w:rFonts w:ascii="Calibri" w:hAnsi="Calibri"/>
-                <w:b w:val="0"/>
-                <w:i w:val="0"/>
-                <w:color w:val="000000"/>
-                <w:sz w:val="17"/>
-              </w:rPr>
-              <w:t>1,99</w:t>
-            </w:r>
-          </w:p>
-        </w:tc>
-      </w:tr>
-      <w:tr>
-        <w:tc>
-          <w:tcPr>
-            <w:tcW w:type="dxa" w:w="3312"/>
-            <w:tcMar>
-              <w:top w:w="100" w:type="dxa"/>
-              <w:start w:w="120" w:type="dxa"/>
-              <w:bottom w:w="100" w:type="dxa"/>
-              <w:end w:w="120" w:type="dxa"/>
-            </w:tcMar>
-            <w:vAlign w:val="center"/>
-            <w:shd w:fill="F2F4F7"/>
-          </w:tcPr>
-          <w:p>
-            <w:pPr>
-              <w:spacing w:after="0"/>
-              <w:jc w:val="left"/>
-            </w:pPr>
-            <w:r>
-              <w:rPr>
-                <w:rFonts w:ascii="Calibri" w:hAnsi="Calibri"/>
-                <w:b w:val="0"/>
-                <w:i w:val="0"/>
-                <w:color w:val="000000"/>
-                <w:sz w:val="17"/>
-              </w:rPr>
-              <w:t>Chronological split tanpa total harga</w:t>
-            </w:r>
-          </w:p>
-        </w:tc>
-        <w:tc>
-          <w:tcPr>
-            <w:tcW w:type="dxa" w:w="2304"/>
-            <w:tcMar>
-              <w:top w:w="100" w:type="dxa"/>
-              <w:start w:w="120" w:type="dxa"/>
-              <w:bottom w:w="100" w:type="dxa"/>
-              <w:end w:w="120" w:type="dxa"/>
-            </w:tcMar>
-            <w:vAlign w:val="center"/>
-            <w:shd w:fill="F2F4F7"/>
-          </w:tcPr>
-          <w:p>
-            <w:pPr>
-              <w:spacing w:after="0"/>
-              <w:jc w:val="center"/>
-            </w:pPr>
-            <w:r>
-              <w:rPr>
-                <w:rFonts w:ascii="Calibri" w:hAnsi="Calibri"/>
-                <w:b w:val="0"/>
-                <w:i w:val="0"/>
-                <w:color w:val="000000"/>
-                <w:sz w:val="17"/>
-              </w:rPr>
-              <w:t>Random Forest</w:t>
-            </w:r>
-          </w:p>
-        </w:tc>
-        <w:tc>
-          <w:tcPr>
-            <w:tcW w:type="dxa" w:w="1152"/>
-            <w:tcMar>
-              <w:top w:w="100" w:type="dxa"/>
-              <w:start w:w="120" w:type="dxa"/>
-              <w:bottom w:w="100" w:type="dxa"/>
-              <w:end w:w="120" w:type="dxa"/>
-            </w:tcMar>
-            <w:vAlign w:val="center"/>
-            <w:shd w:fill="F2F4F7"/>
-          </w:tcPr>
-          <w:p>
-            <w:pPr>
-              <w:spacing w:after="0"/>
-              <w:jc w:val="center"/>
-            </w:pPr>
-            <w:r>
-              <w:rPr>
-                <w:rFonts w:ascii="Calibri" w:hAnsi="Calibri"/>
-                <w:b w:val="0"/>
-                <w:i w:val="0"/>
-                <w:color w:val="000000"/>
-                <w:sz w:val="17"/>
-              </w:rPr>
-              <w:t>-0,0831</w:t>
-            </w:r>
-          </w:p>
-        </w:tc>
-        <w:tc>
-          <w:tcPr>
-            <w:tcW w:type="dxa" w:w="1152"/>
-            <w:tcMar>
-              <w:top w:w="100" w:type="dxa"/>
-              <w:start w:w="120" w:type="dxa"/>
-              <w:bottom w:w="100" w:type="dxa"/>
-              <w:end w:w="120" w:type="dxa"/>
-            </w:tcMar>
-            <w:vAlign w:val="center"/>
-            <w:shd w:fill="F2F4F7"/>
-          </w:tcPr>
-          <w:p>
-            <w:pPr>
-              <w:spacing w:after="0"/>
-              <w:jc w:val="center"/>
-            </w:pPr>
-            <w:r>
-              <w:rPr>
-                <w:rFonts w:ascii="Calibri" w:hAnsi="Calibri"/>
-                <w:b w:val="0"/>
-                <w:i w:val="0"/>
-                <w:color w:val="000000"/>
-                <w:sz w:val="17"/>
-              </w:rPr>
-              <w:t>1,65</w:t>
-            </w:r>
-          </w:p>
-        </w:tc>
-        <w:tc>
-          <w:tcPr>
-            <w:tcW w:type="dxa" w:w="1152"/>
-            <w:tcMar>
-              <w:top w:w="100" w:type="dxa"/>
-              <w:start w:w="120" w:type="dxa"/>
-              <w:bottom w:w="100" w:type="dxa"/>
-              <w:end w:w="120" w:type="dxa"/>
-            </w:tcMar>
-            <w:vAlign w:val="center"/>
-            <w:shd w:fill="F2F4F7"/>
-          </w:tcPr>
-          <w:p>
-            <w:pPr>
-              <w:spacing w:after="0"/>
-              <w:jc w:val="center"/>
-            </w:pPr>
-            <w:r>
-              <w:rPr>
-                <w:rFonts w:ascii="Calibri" w:hAnsi="Calibri"/>
-                <w:b w:val="0"/>
-                <w:i w:val="0"/>
-                <w:color w:val="000000"/>
-                <w:sz w:val="17"/>
-              </w:rPr>
-              <w:t>2,06</w:t>
+              <w:t>3,04</w:t>
             </w:r>
           </w:p>
         </w:tc>
@@ -8889,7 +8550,7 @@
           <w:color w:val="000000"/>
           <w:sz w:val="22"/>
         </w:rPr>
-        <w:t>Python menggunakan kode hari 0 sampai 6, sedangkan DateTime.weekday pada Flutter menggunakan 1 sampai 7. Nilai harus disamakan sebelum dikirim ke model. Selain itu, pemetaan encoded produk dan kategori pada Flutter harus sama persis dengan LabelEncoder saat training.</w:t>
+        <w:t>Python menggunakan kode hari 0 sampai 6 melalui dt.dayofweek (Senin=0), sedangkan DateTime.weekday pada Flutter menggunakan 1 sampai 7 (Senin=1). Nilai harus dipetakan secara konsisten sebelum dikirim ke backend Railway. Selain itu, pemetaan encoded produk dan kategori pada Flutter harus sama persis dengan LabelEncoder saat training di backend Flask.</w:t>
       </w:r>
     </w:p>
     <w:p>
@@ -8957,7 +8618,7 @@
                 <w:color w:val="000000"/>
                 <w:sz w:val="21"/>
               </w:rPr>
-              <w:t>Pengujian model dilakukan menggunakan metode hold-out dengan membagi dataset menjadi 80% data training dan 20% data testing. Dari total 6.742 data transaksi, sebanyak 5.393 data digunakan untuk melatih model dan 1.349 data digunakan untuk menguji performa model. Pembagian data menggunakan random_state sebesar 42 agar hasil pembagian dapat direproduksi. Evaluasi dilakukan menggunakan koefisien determinasi R², Mean Absolute Error, dan Root Mean Squared Error.</w:t>
+              <w:t>Pengujian model dilakukan menggunakan metode chronological split dengan membagi dataset bersih menjadi 80% data training dan 20% data testing. Dari total 6.742 data transaksi (6.741 data bersih setelah pembersihan 1 missing value), sebanyak 5.392 data digunakan sebagai training set (periode awal 2021-01-01 s/d 2024-12-28) dan 1.349 data digunakan sebagai testing set (periode akhir 2024-12-28 s/d 2025-12-31). Pembagian data diurutkan secara kronologis berdasarkan tanggal transaksi untuk mengevaluasi kemampuan peramalan model secara realistis. Evaluasi dilakukan menggunakan koefisien determinasi R², Mean Absolute Error, dan Root Mean Squared Error.</w:t>
             </w:r>
           </w:p>
         </w:tc>
@@ -9025,7 +8686,7 @@
                 <w:color w:val="000000"/>
                 <w:sz w:val="21"/>
               </w:rPr>
-              <w:t>Berdasarkan pengujian awal, Linear Regression menghasilkan R² sebesar 0,7813, MAE sebesar 0,63, dan RMSE sebesar 0,91. Random Forest menghasilkan R² sebesar 0,9964, MAE sebesar 0,03, dan RMSE sebesar 0,12. Secara numerik, Random Forest memberikan hasil prediksi yang lebih dekat terhadap nilai aktual pada testing set dibandingkan Linear Regression.</w:t>
+              <w:t>Berdasarkan hasil pengujian model tanpa data leakage, Linear Regression menghasilkan R² sebesar -0,0039, MAE sebesar 2,49, dan RMSE sebesar 2,86. Random Forest menghasilkan R² sebesar -0,1338, MAE sebesar 2,59, dan RMSE sebesar 3,04. Secara numerik, model Linear Regression memberikan kesalahan rata-rata (MAE) yang sedikit lebih rendah dibandingkan Random Forest pada data testing.</w:t>
             </w:r>
           </w:p>
         </w:tc>
@@ -9093,7 +8754,7 @@
                 <w:color w:val="000000"/>
                 <w:sz w:val="21"/>
               </w:rPr>
-              <w:t>Evaluasi lanjutan menunjukkan bahwa nilai Random Forest yang sangat tinggi dipengaruhi oleh penggunaan fitur total_harga_update. Fitur tersebut dihitung dari harga_satuan_update dikalikan jumlah_permintaan_bahan yang menjadi target model. Kondisi ini menimbulkan data leakage karena fitur mengandung informasi langsung mengenai target. Oleh karena itu, hasil R² sebesar 0,9964 harus dipahami sebagai performa pada konfigurasi dataset awal dan belum sepenuhnya menggambarkan kemampuan prediksi permintaan masa depan.</w:t>
+              <w:t>Evaluasi model ini dilakukan setelah mengeluarkan fitur total_harga_update untuk menghindari data leakage. Pada pengujian awal sebelum fitur tersebut dikeluarkan, model Random Forest sempat memperoleh R² sebesar 0,9964, MAE sebesar 0,03, dan RMSE sebesar 0,12. Namun, nilai tersebut tidak valid untuk menggambarkan kemampuan prediksi masa depan karena fitur total harga dihitung langsung dari target (jumlah permintaan). Setelah perbaikan metodologi dengan menghapus fitur total harga, diperoleh hasil pengujian aktual yang lebih realistis dan aman dari data leakage.</w:t>
             </w:r>
           </w:p>
         </w:tc>
@@ -9198,7 +8859,7 @@
           <w:color w:val="000000"/>
           <w:sz w:val="22"/>
         </w:rPr>
-        <w:t>Jawaban: Proses testing dilakukan dengan membagi 6.742 data menjadi 80% data training dan 20% data testing. Model mempelajari pola dari 5.393 data training, kemudian menghasilkan prediksi untuk 1.349 data testing yang tidak digunakan saat pelatihan. Hasil prediksi dibandingkan dengan nilai aktual menggunakan R², MAE, dan RMSE.</w:t>
+        <w:t>Jawaban: Proses testing dilakukan dengan membagi 6.742 data transaksi (dengan 1 baris dieliminasi karena mengandung missing value sehingga tersisa 6.741 data bersih) menjadi 80% data training (5.392 data, periode awal) dan 20% data testing (1.349 data, periode akhir) secara kronologis berdasarkan urutan tanggal. Model mempelajari pola dari data training untuk kemudian memprediksi data testing. Hasil prediksi dievaluasi menggunakan R², MAE, dan RMSE.</w:t>
       </w:r>
     </w:p>
     <w:p>
@@ -9227,7 +8888,7 @@
         <w:pStyle w:val="Heading2"/>
       </w:pPr>
       <w:r>
-        <w:t>12.3 Mengapa Random Forest Lebih Baik?</w:t>
+        <w:t>12.3 Mengapa Hasil Evaluasi R² Bernilai Negatif?</w:t>
       </w:r>
     </w:p>
     <w:p>
@@ -9240,7 +8901,7 @@
           <w:color w:val="000000"/>
           <w:sz w:val="22"/>
         </w:rPr>
-        <w:t>Jawaban: Pada konfigurasi testing awal, Random Forest lebih baik karena mampu menangkap hubungan non-linear dan menggabungkan prediksi dari 100 Decision Tree. Namun, performa yang sangat tinggi juga disebabkan total harga yang memiliki hubungan langsung dengan target.</w:t>
+        <w:t>Jawaban: Nilai R² negatif pada data testing (Linear Regression: -0,0039, Random Forest: -0,1338) menunjukkan bahwa model kesulitan untuk memprediksi data masa depan berdasarkan urutan waktu (chronological split) setelah fitur data leakage (total_harga_update) dihapus. Hal ini mengonfirmasi bahwa fitur waktu kalender saja belum cukup kuat untuk menangkap fluktuasi pola permintaan rill, sehingga performanya di bawah tebakan rata-rata.</w:t>
       </w:r>
     </w:p>
     <w:p>
@@ -9248,7 +8909,7 @@
         <w:pStyle w:val="Heading2"/>
       </w:pPr>
       <w:r>
-        <w:t>12.4 Apakah R² 0,9964 Berarti Akurasi 99,64%?</w:t>
+        <w:t>12.4 Bagaimana Hasil Model yang Di-deploy di Railway?</w:t>
       </w:r>
     </w:p>
     <w:p>
@@ -9261,7 +8922,7 @@
           <w:color w:val="000000"/>
           <w:sz w:val="22"/>
         </w:rPr>
-        <w:t>Jawaban: Tidak sepenuhnya. R² sebesar 0,9964 berarti model menjelaskan sekitar 99,64% variasi target pada testing set. R² bukan akurasi klasifikasi. Selain itu, nilai tersebut dipengaruhi data leakage sehingga belum mewakili kemampuan prediksi masa depan secara valid.</w:t>
+        <w:t>Jawaban: Model backend Flask yang di-deploy di Railway adalah model Random Forest yang dilatih tanpa menggunakan fitur total_harga_update untuk memastikan kebebasan dari data leakage. Model ini diakses oleh aplikasi Flutter sebagai frontend melalui API. Model ini memiliki metrik evaluasi R² sebesar -0,1338, MAE sebesar 2,59, dan RMSE sebesar 3,04 pada data testing. Walaupun secara angka lebih rendah dibandingkan model awal dengan leakage, performa ini jauh lebih valid dan dapat diandalkan secara akademis.</w:t>
       </w:r>
     </w:p>
     <w:p>
@@ -9269,7 +8930,7 @@
         <w:pStyle w:val="Heading2"/>
       </w:pPr>
       <w:r>
-        <w:t>12.5 Apakah Model Mengalami Overfitting?</w:t>
+        <w:t>12.5 Apakah Model Mengalami Overfitting Setelah Leakage Dihapus?</w:t>
       </w:r>
     </w:p>
     <w:p>
@@ -9282,7 +8943,7 @@
           <w:color w:val="000000"/>
           <w:sz w:val="22"/>
         </w:rPr>
-        <w:t>Jawaban: Selisih R² training dan testing kecil, sehingga secara angka awal tidak menunjukkan overfitting yang besar. Akan tetapi, terdapat masalah yang lebih penting, yaitu data leakage. Leakage membuat training dan testing sama-sama mudah diprediksi karena keduanya mengandung informasi target.</w:t>
+        <w:t>Jawaban: Ya. Setelah fitur total_harga_update dihapus, model Random Forest menunjukkan indikasi overfitting yang sangat kuat di mana R² training bernilai cukup baik (0,6913) tetapi R² testing anjlok menjadi negatif (-0,1338). Ini membuktikan model menghafal pola data training tetapi gagal dalam melakukan generalisasi pada data pengujian baru.</w:t>
       </w:r>
     </w:p>
     <w:p>

</xml_diff>